<commit_message>
[TCV] Increase min font to 10
</commit_message>
<xml_diff>
--- a/skills/targeted-cv/assets/targeted-cv-template.docx
+++ b/skills/targeted-cv/assets/targeted-cv-template.docx
@@ -105,7 +105,7 @@
       <w:r>
         <w:rPr>
           <w:rFonts w:ascii="Arial" w:hAnsi="Arial"/>
-          <w:sz w:val="18"/>
+          <w:sz w:val="20"/>
         </w:rPr>
         <w:t>{{PROFILE_SUMMARY}}</w:t>
       </w:r>
@@ -167,7 +167,7 @@
                 <w:rFonts w:ascii="Arial" w:hAnsi="Arial"/>
                 <w:b/>
                 <w:color w:val="232323"/>
-                <w:sz w:val="18"/>
+                <w:sz w:val="20"/>
               </w:rPr>
               <w:t>{{EXPERTISE_1_TITLE}}</w:t>
             </w:r>
@@ -181,7 +181,7 @@
                 <w:rFonts w:ascii="Arial" w:hAnsi="Arial"/>
                 <w:b w:val="0"/>
                 <w:color w:val="373737"/>
-                <w:sz w:val="17"/>
+                <w:sz w:val="20"/>
               </w:rPr>
               <w:t>{{EXPERTISE_1_DETAIL}}</w:t>
             </w:r>
@@ -208,7 +208,7 @@
                 <w:rFonts w:ascii="Arial" w:hAnsi="Arial"/>
                 <w:b/>
                 <w:color w:val="232323"/>
-                <w:sz w:val="18"/>
+                <w:sz w:val="20"/>
               </w:rPr>
               <w:t>{{EXPERTISE_2_TITLE}}</w:t>
             </w:r>
@@ -222,7 +222,7 @@
                 <w:rFonts w:ascii="Arial" w:hAnsi="Arial"/>
                 <w:b w:val="0"/>
                 <w:color w:val="373737"/>
-                <w:sz w:val="17"/>
+                <w:sz w:val="20"/>
               </w:rPr>
               <w:t>{{EXPERTISE_2_DETAIL}}</w:t>
             </w:r>
@@ -251,7 +251,7 @@
                 <w:rFonts w:ascii="Arial" w:hAnsi="Arial"/>
                 <w:b/>
                 <w:color w:val="232323"/>
-                <w:sz w:val="18"/>
+                <w:sz w:val="20"/>
               </w:rPr>
               <w:t>{{EXPERTISE_3_TITLE}}</w:t>
             </w:r>
@@ -265,7 +265,7 @@
                 <w:rFonts w:ascii="Arial" w:hAnsi="Arial"/>
                 <w:b w:val="0"/>
                 <w:color w:val="373737"/>
-                <w:sz w:val="17"/>
+                <w:sz w:val="20"/>
               </w:rPr>
               <w:t>{{EXPERTISE_3_DETAIL}}</w:t>
             </w:r>
@@ -292,7 +292,7 @@
                 <w:rFonts w:ascii="Arial" w:hAnsi="Arial"/>
                 <w:b/>
                 <w:color w:val="232323"/>
-                <w:sz w:val="18"/>
+                <w:sz w:val="20"/>
               </w:rPr>
               <w:t>{{EXPERTISE_4_TITLE}}</w:t>
             </w:r>
@@ -306,7 +306,7 @@
                 <w:rFonts w:ascii="Arial" w:hAnsi="Arial"/>
                 <w:b w:val="0"/>
                 <w:color w:val="373737"/>
-                <w:sz w:val="17"/>
+                <w:sz w:val="20"/>
               </w:rPr>
               <w:t>{{EXPERTISE_4_DETAIL}}</w:t>
             </w:r>
@@ -335,7 +335,7 @@
                 <w:rFonts w:ascii="Arial" w:hAnsi="Arial"/>
                 <w:b/>
                 <w:color w:val="232323"/>
-                <w:sz w:val="18"/>
+                <w:sz w:val="20"/>
               </w:rPr>
               <w:t>{{EXPERTISE_5_TITLE}}</w:t>
             </w:r>
@@ -349,7 +349,7 @@
                 <w:rFonts w:ascii="Arial" w:hAnsi="Arial"/>
                 <w:b w:val="0"/>
                 <w:color w:val="373737"/>
-                <w:sz w:val="17"/>
+                <w:sz w:val="20"/>
               </w:rPr>
               <w:t>{{EXPERTISE_5_DETAIL}}</w:t>
             </w:r>
@@ -376,7 +376,7 @@
                 <w:rFonts w:ascii="Arial" w:hAnsi="Arial"/>
                 <w:b/>
                 <w:color w:val="232323"/>
-                <w:sz w:val="18"/>
+                <w:sz w:val="20"/>
               </w:rPr>
               <w:t>{{EXPERTISE_6_TITLE}}</w:t>
             </w:r>
@@ -390,7 +390,7 @@
                 <w:rFonts w:ascii="Arial" w:hAnsi="Arial"/>
                 <w:b w:val="0"/>
                 <w:color w:val="373737"/>
-                <w:sz w:val="17"/>
+                <w:sz w:val="20"/>
               </w:rPr>
               <w:t>{{EXPERTISE_6_DETAIL}}</w:t>
             </w:r>
@@ -422,7 +422,7 @@
         <w:rPr>
           <w:rFonts w:ascii="Arial" w:hAnsi="Arial"/>
           <w:b/>
-          <w:sz w:val="19"/>
+          <w:sz w:val="20"/>
         </w:rPr>
         <w:t>{{ROLE_TITLE}} - {{EMPLOYER}}</w:t>
       </w:r>
@@ -431,7 +431,7 @@
           <w:rFonts w:ascii="Arial" w:hAnsi="Arial"/>
           <w:b w:val="0"/>
           <w:color w:val="555555"/>
-          <w:sz w:val="18"/>
+          <w:sz w:val="20"/>
         </w:rPr>
         <w:t>  |  {{ROLE_DATES}}</w:t>
       </w:r>
@@ -441,7 +441,7 @@
           <w:b w:val="0"/>
           <w:i/>
           <w:color w:val="555555"/>
-          <w:sz w:val="17"/>
+          <w:sz w:val="20"/>
         </w:rPr>
       </w:r>
     </w:p>
@@ -452,7 +452,7 @@
       <w:r>
         <w:rPr>
           <w:rFonts w:ascii="Arial" w:hAnsi="Arial"/>
-          <w:sz w:val="18"/>
+          <w:sz w:val="20"/>
         </w:rPr>
         <w:t>• {{ROLE_ACHIEVEMENT}}</w:t>
       </w:r>
@@ -467,7 +467,7 @@
           <w:b w:val="0"/>
           <w:i/>
           <w:color w:val="4B4B4B"/>
-          <w:sz w:val="16"/>
+          <w:sz w:val="20"/>
         </w:rPr>
         <w:t>Environment: {{ROLE_ENVIRONMENT}}</w:t>
       </w:r>
@@ -495,7 +495,7 @@
       <w:r>
         <w:rPr>
           <w:rFonts w:ascii="Arial" w:hAnsi="Arial"/>
-          <w:sz w:val="18"/>
+          <w:sz w:val="20"/>
         </w:rPr>
         <w:t>• {{ENGINEERING_STRENGTH}}</w:t>
       </w:r>
@@ -524,27 +524,27 @@
         <w:rPr>
           <w:rFonts w:ascii="Arial" w:hAnsi="Arial"/>
           <w:b/>
-          <w:sz w:val="17"/>
+          <w:sz w:val="20"/>
         </w:rPr>
         <w:t>{{SKILL_GROUP}}: {{SKILLS}}</w:t>
       </w:r>
       <w:r>
         <w:rPr>
           <w:rFonts w:ascii="Arial" w:hAnsi="Arial"/>
-          <w:sz w:val="17"/>
+          <w:sz w:val="20"/>
         </w:rPr>
       </w:r>
       <w:r>
         <w:rPr>
           <w:rFonts w:ascii="Arial" w:hAnsi="Arial"/>
           <w:b/>
-          <w:sz w:val="17"/>
+          <w:sz w:val="20"/>
         </w:rPr>
       </w:r>
       <w:r>
         <w:rPr>
           <w:rFonts w:ascii="Arial" w:hAnsi="Arial"/>
-          <w:sz w:val="17"/>
+          <w:sz w:val="20"/>
         </w:rPr>
       </w:r>
     </w:p>
@@ -588,27 +588,27 @@
         <w:rPr>
           <w:rFonts w:ascii="Arial" w:hAnsi="Arial"/>
           <w:b/>
-          <w:sz w:val="17"/>
+          <w:sz w:val="20"/>
         </w:rPr>
         <w:t>Certificates: {{CERTIFICATES}}</w:t>
       </w:r>
       <w:r>
         <w:rPr>
           <w:rFonts w:ascii="Arial" w:hAnsi="Arial"/>
-          <w:sz w:val="17"/>
+          <w:sz w:val="20"/>
         </w:rPr>
       </w:r>
       <w:r>
         <w:rPr>
           <w:rFonts w:ascii="Arial" w:hAnsi="Arial"/>
           <w:b/>
-          <w:sz w:val="17"/>
+          <w:sz w:val="20"/>
         </w:rPr>
       </w:r>
       <w:r>
         <w:rPr>
           <w:rFonts w:ascii="Arial" w:hAnsi="Arial"/>
-          <w:sz w:val="17"/>
+          <w:sz w:val="20"/>
         </w:rPr>
       </w:r>
     </w:p>
@@ -620,27 +620,27 @@
         <w:rPr>
           <w:rFonts w:ascii="Arial" w:hAnsi="Arial"/>
           <w:b/>
-          <w:sz w:val="17"/>
+          <w:sz w:val="20"/>
         </w:rPr>
         <w:t>Languages: {{LANGUAGES}}</w:t>
       </w:r>
       <w:r>
         <w:rPr>
           <w:rFonts w:ascii="Arial" w:hAnsi="Arial"/>
-          <w:sz w:val="17"/>
+          <w:sz w:val="20"/>
         </w:rPr>
       </w:r>
       <w:r>
         <w:rPr>
           <w:rFonts w:ascii="Arial" w:hAnsi="Arial"/>
           <w:b/>
-          <w:sz w:val="17"/>
+          <w:sz w:val="20"/>
         </w:rPr>
       </w:r>
       <w:r>
         <w:rPr>
           <w:rFonts w:ascii="Arial" w:hAnsi="Arial"/>
-          <w:sz w:val="17"/>
+          <w:sz w:val="20"/>
         </w:rPr>
       </w:r>
     </w:p>
@@ -652,27 +652,27 @@
         <w:rPr>
           <w:rFonts w:ascii="Arial" w:hAnsi="Arial"/>
           <w:b/>
-          <w:sz w:val="17"/>
+          <w:sz w:val="20"/>
         </w:rPr>
         <w:t>Availability: {{AVAILABILITY}}</w:t>
       </w:r>
       <w:r>
         <w:rPr>
           <w:rFonts w:ascii="Arial" w:hAnsi="Arial"/>
-          <w:sz w:val="17"/>
+          <w:sz w:val="20"/>
         </w:rPr>
       </w:r>
       <w:r>
         <w:rPr>
           <w:rFonts w:ascii="Arial" w:hAnsi="Arial"/>
           <w:b/>
-          <w:sz w:val="17"/>
+          <w:sz w:val="20"/>
         </w:rPr>
       </w:r>
       <w:r>
         <w:rPr>
           <w:rFonts w:ascii="Arial" w:hAnsi="Arial"/>
-          <w:sz w:val="17"/>
+          <w:sz w:val="20"/>
         </w:rPr>
       </w:r>
     </w:p>
@@ -914,7 +914,7 @@
 </file>
 
 <file path=word/styles.xml><?xml version="1.0" encoding="utf-8"?>
-<w:styles xmlns:mc="http://schemas.openxmlformats.org/markup-compatibility/2006" xmlns:r="http://schemas.openxmlformats.org/officeDocument/2006/relationships" xmlns:w="http://schemas.openxmlformats.org/wordprocessingml/2006/main" xmlns:w14="http://schemas.microsoft.com/office/word/2010/wordml" mc:Ignorable="w14">
+<w:styles xmlns:mc="http://schemas.openxmlformats.org/markup-compatibility/2006" xmlns:w="http://schemas.openxmlformats.org/wordprocessingml/2006/main" mc:Ignorable="w14">
   <w:docDefaults>
     <w:rPrDefault>
       <w:rPr>
@@ -12785,7 +12785,7 @@
     <w:rPr>
       <w:rFonts w:ascii="Arial" w:hAnsi="Arial"/>
       <w:b/>
-      <w:sz w:val="19"/>
+      <w:sz w:val="20"/>
     </w:rPr>
   </w:style>
   <w:style w:type="paragraph" w:customStyle="1" w:styleId="CVBullet">
@@ -12796,7 +12796,7 @@
     </w:pPr>
     <w:rPr>
       <w:rFonts w:ascii="Arial" w:hAnsi="Arial"/>
-      <w:sz w:val="18"/>
+      <w:sz w:val="20"/>
     </w:rPr>
   </w:style>
   <w:style w:type="paragraph" w:customStyle="1" w:styleId="CVEnv">
@@ -12808,7 +12808,7 @@
       <w:rFonts w:ascii="Arial" w:hAnsi="Arial"/>
       <w:i/>
       <w:color w:val="4B4B4B"/>
-      <w:sz w:val="16"/>
+      <w:sz w:val="20"/>
     </w:rPr>
   </w:style>
 </w:styles>

</xml_diff>